<commit_message>
Eliminar la sección de referencias y soporte de la guía de usuario
</commit_message>
<xml_diff>
--- a/docs/user-guide.docx
+++ b/docs/user-guide.docx
@@ -1542,49 +1542,9 @@
         <w:t>When reporting an issue, include the program used, customer/product/version names, time, exact error text, and whether Save As opened or a ZIP was saved. Do not include the password. A screenshot can help if it shows the status message without exposing credentials.</w:t>
       </w:r>
     </w:p>
-    <w:p>
-      <w:pPr>
-        <w:pStyle w:val="Heading1"/>
-      </w:pPr>
-      <w:r>
-        <w:t>Reference and support</w:t>
-      </w:r>
-    </w:p>
-    <w:p>
-      <w:r>
-        <w:t>The configured server is https://tytan.poznan.pl/SQLupdate/. The administrator owns hosting credentials, cloud folder/package contents, and correct installed-version information. The updater provides comparison and downloading; Tytan supplies the installation procedure.</w:t>
-      </w:r>
-    </w:p>
-    <w:p>
-      <w:r>
-        <w:t xml:space="preserve">Technical details and source excerpts are in </w:t>
-      </w:r>
-      <w:hyperlink r:id="rId9">
-        <w:r>
-          <w:rPr>
-            <w:rStyle w:val="Hyperlink"/>
-          </w:rPr>
-          <w:t>Technical guide</w:t>
-        </w:r>
-      </w:hyperlink>
-      <w:r>
-        <w:t xml:space="preserve">. Hosting setup is in </w:t>
-      </w:r>
-      <w:hyperlink r:id="rId10">
-        <w:r>
-          <w:rPr>
-            <w:rStyle w:val="Hyperlink"/>
-          </w:rPr>
-          <w:t>Server guide</w:t>
-        </w:r>
-      </w:hyperlink>
-      <w:r>
-        <w:t>. Documentation is provided separately from the preserved original executable ZIP.</w:t>
-      </w:r>
-    </w:p>
     <w:sectPr>
-      <w:headerReference w:type="default" r:id="rId11"/>
-      <w:footerReference w:type="default" r:id="rId12"/>
+      <w:headerReference w:type="default" r:id="rId9"/>
+      <w:footerReference w:type="default" r:id="rId10"/>
       <w:pgSz w:w="11906" w:h="16838"/>
       <w:pgMar w:top="1134" w:right="1020" w:bottom="1134" w:left="1020" w:header="720" w:footer="720" w:gutter="0"/>
       <w:cols w:space="720"/>

</xml_diff>